<commit_message>
docs(handover): record web tests passing on Node 24.22.0
Co-Authored-By: Claude Sonnet 5.5 <noreply@anthropic.com>
</commit_message>
<xml_diff>
--- a/docs/export/handover/2026-10-26_s1-tv1_bao-cao-ban-giao-sprint-1.docx
+++ b/docs/export/handover/2026-10-26_s1-tv1_bao-cao-ban-giao-sprint-1.docx
@@ -2793,7 +2793,7 @@
               <w:rPr>
                 <w:sz w:val="19"/>
               </w:rPr>
-              <w:t>Đạt</w:t>
+              <w:t>Đạt (Node 22.14 và 24.22.0)</w:t>
             </w:r>
           </w:p>
         </w:tc>
@@ -2842,16 +2842,22 @@
             </w:r>
             <w:r>
               <w:rPr>
+                <w:sz w:val="19"/>
+              </w:rPr>
+              <w:t xml:space="preserve">Trên </w:t>
+            </w:r>
+            <w:r>
+              <w:rPr>
                 <w:b/>
                 <w:sz w:val="19"/>
               </w:rPr>
-              <w:t>2/2 fail trên máy lập báo cáo</w:t>
-            </w:r>
-            <w:r>
-              <w:rPr>
-                <w:sz w:val="19"/>
-              </w:rPr>
-              <w:t xml:space="preserve"> (Node 22.14: </w:t>
+              <w:t>Node 24.22.0: 8/8 đạt</w:t>
+            </w:r>
+            <w:r>
+              <w:rPr>
+                <w:sz w:val="19"/>
+              </w:rPr>
+              <w:t xml:space="preserve"> (SSE, UTF-8/CRLF, stream bị ngắt, HTTP 429, nguồn lỗi, ngôn ngữ). Trên Node 22.14 báo lỗi </w:t>
             </w:r>
             <w:r>
               <w:rPr>
@@ -2864,20 +2870,7 @@
               <w:rPr>
                 <w:sz w:val="19"/>
               </w:rPr>
-              <w:t xml:space="preserve">). Dự án yêu cầu Node 24.22, nên đây là lỗi môi trường; </w:t>
-            </w:r>
-            <w:r>
-              <w:rPr>
-                <w:b/>
-                <w:sz w:val="19"/>
-              </w:rPr>
-              <w:t>chưa chạy được trên Node 24</w:t>
-            </w:r>
-            <w:r>
-              <w:rPr>
-                <w:sz w:val="19"/>
-              </w:rPr>
-              <w:t xml:space="preserve"> để xác nhận test đạt</w:t>
+              <w:t>, tức lỗi môi trường chứ không phải lỗi test</w:t>
             </w:r>
           </w:p>
         </w:tc>
@@ -2941,7 +2934,20 @@
               <w:rPr>
                 <w:sz w:val="19"/>
               </w:rPr>
-              <w:t>Đạt</w:t>
+              <w:t>Đạt (</w:t>
+            </w:r>
+            <w:r>
+              <w:rPr>
+                <w:rFonts w:ascii="Consolas" w:hAnsi="Consolas"/>
+                <w:sz w:val="19"/>
+              </w:rPr>
+              <w:t>typecheck</w:t>
+            </w:r>
+            <w:r>
+              <w:rPr>
+                <w:sz w:val="19"/>
+              </w:rPr>
+              <w:t xml:space="preserve"> chạy lại trên Node 24.22.0)</w:t>
             </w:r>
           </w:p>
         </w:tc>

</xml_diff>